<commit_message>
Segundo commit: añado segunda línea.
</commit_message>
<xml_diff>
--- a/Miguel_prueba_git.docx
+++ b/Miguel_prueba_git.docx
@@ -12,7 +12,29 @@
       </w:r>
       <w:proofErr w:type="spellEnd"/>
       <w:r>
-        <w:t>: Creación archivo prueba git.</w:t>
+        <w:t xml:space="preserve">: Creación archivo prueba </w:t>
+      </w:r>
+      <w:proofErr w:type="spellStart"/>
+      <w:r>
+        <w:t>git</w:t>
+      </w:r>
+      <w:proofErr w:type="spellEnd"/>
+      <w:r>
+        <w:t>.</w:t>
+      </w:r>
+    </w:p>
+    <w:p/>
+    <w:p>
+      <w:r>
+        <w:t xml:space="preserve">Segundo </w:t>
+      </w:r>
+      <w:proofErr w:type="spellStart"/>
+      <w:r>
+        <w:t>commit</w:t>
+      </w:r>
+      <w:proofErr w:type="spellEnd"/>
+      <w:r>
+        <w:t>: voy a ver si se ven los cambios en la ventana central.</w:t>
       </w:r>
       <w:bookmarkStart w:id="0" w:name="_GoBack"/>
       <w:bookmarkEnd w:id="0"/>

</xml_diff>

<commit_message>
Tercer commit: Borrado segunda línea
</commit_message>
<xml_diff>
--- a/Miguel_prueba_git.docx
+++ b/Miguel_prueba_git.docx
@@ -34,10 +34,32 @@
       </w:r>
       <w:proofErr w:type="spellEnd"/>
       <w:r>
-        <w:t>: voy a ver si se ven los cambios en la ventana central.</w:t>
+        <w:t xml:space="preserve">: </w:t>
       </w:r>
       <w:bookmarkStart w:id="0" w:name="_GoBack"/>
       <w:bookmarkEnd w:id="0"/>
+    </w:p>
+    <w:p/>
+    <w:p>
+      <w:r>
+        <w:t xml:space="preserve">Tercer </w:t>
+      </w:r>
+      <w:proofErr w:type="spellStart"/>
+      <w:r>
+        <w:t>commit</w:t>
+      </w:r>
+      <w:proofErr w:type="spellEnd"/>
+      <w:r>
+        <w:t xml:space="preserve">: voy a borrar una línea, la del segundo </w:t>
+      </w:r>
+      <w:proofErr w:type="spellStart"/>
+      <w:r>
+        <w:t>commit</w:t>
+      </w:r>
+      <w:proofErr w:type="spellEnd"/>
+      <w:r>
+        <w:t>.</w:t>
+      </w:r>
     </w:p>
     <w:sectPr>
       <w:pgSz w:w="11906" w:h="16838"/>

</xml_diff>